<commit_message>
Adicionar o campo legalName e blocos de briefing
</commit_message>
<xml_diff>
--- a/public/templates/briefing.docx
+++ b/public/templates/briefing.docx
@@ -131,7 +131,7 @@
                 <w:sz w:val="22"/>
                 <w:szCs w:val="22"/>
               </w:rPr>
-              <w:t xml:space="preserve">Nome comercial</w:t>
+              <w:t xml:space="preserve">Nome comercial (nome fantasia)</w:t>
             </w:r>
           </w:p>
         </w:tc>
@@ -196,7 +196,7 @@
                 <w:sz w:val="22"/>
                 <w:szCs w:val="22"/>
               </w:rPr>
-              <w:t xml:space="preserve">Razão social / CNPJ (se houver)</w:t>
+              <w:t xml:space="preserve">Razão social (se empresa)</w:t>
             </w:r>
           </w:p>
         </w:tc>
@@ -226,7 +226,7 @@
                 <w:sz w:val="22"/>
                 <w:szCs w:val="22"/>
               </w:rPr>
-              <w:t xml:space="preserve">{cnpjCpf}</w:t>
+              <w:t xml:space="preserve">{legalName}</w:t>
             </w:r>
           </w:p>
         </w:tc>
@@ -261,7 +261,7 @@
                 <w:sz w:val="22"/>
                 <w:szCs w:val="22"/>
               </w:rPr>
-              <w:t xml:space="preserve">Cidade / estado</w:t>
+              <w:t xml:space="preserve">CNPJ / CPF</w:t>
             </w:r>
           </w:p>
         </w:tc>
@@ -291,7 +291,7 @@
                 <w:sz w:val="22"/>
                 <w:szCs w:val="22"/>
               </w:rPr>
-              <w:t xml:space="preserve">{address}</w:t>
+              <w:t xml:space="preserve">{cnpjCpf}</w:t>
             </w:r>
           </w:p>
         </w:tc>
@@ -326,7 +326,7 @@
                 <w:sz w:val="22"/>
                 <w:szCs w:val="22"/>
               </w:rPr>
-              <w:t xml:space="preserve">WhatsApp comercial</w:t>
+              <w:t xml:space="preserve">Endereço</w:t>
             </w:r>
           </w:p>
         </w:tc>
@@ -356,7 +356,7 @@
                 <w:sz w:val="22"/>
                 <w:szCs w:val="22"/>
               </w:rPr>
-              <w:t xml:space="preserve">{whatsapp}</w:t>
+              <w:t xml:space="preserve">{address}</w:t>
             </w:r>
           </w:p>
         </w:tc>
@@ -391,7 +391,7 @@
                 <w:sz w:val="22"/>
                 <w:szCs w:val="22"/>
               </w:rPr>
-              <w:t xml:space="preserve">Telefone / e-mail</w:t>
+              <w:t xml:space="preserve">WhatsApp comercial</w:t>
             </w:r>
           </w:p>
         </w:tc>
@@ -421,7 +421,7 @@
                 <w:sz w:val="22"/>
                 <w:szCs w:val="22"/>
               </w:rPr>
-              <w:t xml:space="preserve">{email}</w:t>
+              <w:t xml:space="preserve">{whatsapp}</w:t>
             </w:r>
           </w:p>
         </w:tc>
@@ -456,6 +456,71 @@
                 <w:sz w:val="22"/>
                 <w:szCs w:val="22"/>
               </w:rPr>
+              <w:t xml:space="preserve">E-mail</w:t>
+            </w:r>
+          </w:p>
+        </w:tc>
+        <w:tc>
+          <w:tcPr>
+            <w:tcW w:type="pct" w:w="60%"/>
+            <w:tcBorders>
+              <w:top w:val="single" w:color="CCCCCC" w:sz="4"/>
+              <w:left w:val="single" w:color="CCCCCC" w:sz="4"/>
+              <w:bottom w:val="single" w:color="CCCCCC" w:sz="4"/>
+              <w:right w:val="single" w:color="CCCCCC" w:sz="4"/>
+            </w:tcBorders>
+            <w:tcMar>
+              <w:top w:type="dxa" w:w="60"/>
+              <w:left w:type="dxa" w:w="100"/>
+              <w:bottom w:type="dxa" w:w="60"/>
+              <w:right w:type="dxa" w:w="100"/>
+            </w:tcMar>
+          </w:tcPr>
+          <w:p>
+            <w:pPr>
+              <w:spacing w:after="40"/>
+            </w:pPr>
+            <w:r>
+              <w:rPr>
+                <w:rFonts w:ascii="Calibri" w:cs="Calibri" w:eastAsia="Calibri" w:hAnsi="Calibri"/>
+                <w:sz w:val="22"/>
+                <w:szCs w:val="22"/>
+              </w:rPr>
+              <w:t xml:space="preserve">{email}</w:t>
+            </w:r>
+          </w:p>
+        </w:tc>
+      </w:tr>
+      <w:tr>
+        <w:tc>
+          <w:tcPr>
+            <w:tcW w:type="pct" w:w="40%"/>
+            <w:tcBorders>
+              <w:top w:val="single" w:color="CCCCCC" w:sz="4"/>
+              <w:left w:val="single" w:color="CCCCCC" w:sz="4"/>
+              <w:bottom w:val="single" w:color="CCCCCC" w:sz="4"/>
+              <w:right w:val="single" w:color="CCCCCC" w:sz="4"/>
+            </w:tcBorders>
+            <w:shd w:fill="EEF3FA"/>
+            <w:tcMar>
+              <w:top w:type="dxa" w:w="60"/>
+              <w:left w:type="dxa" w:w="100"/>
+              <w:bottom w:type="dxa" w:w="60"/>
+              <w:right w:type="dxa" w:w="100"/>
+            </w:tcMar>
+          </w:tcPr>
+          <w:p>
+            <w:pPr>
+              <w:spacing w:after="40"/>
+            </w:pPr>
+            <w:r>
+              <w:rPr>
+                <w:rFonts w:ascii="Calibri" w:cs="Calibri" w:eastAsia="Calibri" w:hAnsi="Calibri"/>
+                <w:b/>
+                <w:bCs/>
+                <w:sz w:val="22"/>
+                <w:szCs w:val="22"/>
+              </w:rPr>
               <w:t xml:space="preserve">Site ou domínio atual</w:t>
             </w:r>
           </w:p>
@@ -486,7 +551,7 @@
                 <w:sz w:val="22"/>
                 <w:szCs w:val="22"/>
               </w:rPr>
-              <w:t xml:space="preserve">{domain}</w:t>
+              <w:t xml:space="preserve"/>
             </w:r>
           </w:p>
         </w:tc>
@@ -805,6 +870,36 @@
     </w:p>
     <w:p>
       <w:pPr>
+        <w:spacing w:after="140"/>
+        <w:jc w:val="both"/>
+      </w:pPr>
+      <w:r>
+        <w:rPr>
+          <w:rFonts w:ascii="Calibri" w:cs="Calibri" w:eastAsia="Calibri" w:hAnsi="Calibri"/>
+          <w:b/>
+          <w:bCs/>
+          <w:sz w:val="22"/>
+          <w:szCs w:val="22"/>
+        </w:rPr>
+        <w:t xml:space="preserve">Você pode publicar preços ou valores no site, ou prefere que apareça apenas "consulte"? Se puder publicar, envie a tabela de preços.</w:t>
+      </w:r>
+    </w:p>
+    <w:p>
+      <w:pPr>
+        <w:spacing w:after="140"/>
+        <w:jc w:val="both"/>
+      </w:pPr>
+      <w:r>
+        <w:rPr>
+          <w:rFonts w:ascii="Calibri" w:cs="Calibri" w:eastAsia="Calibri" w:hAnsi="Calibri"/>
+          <w:sz w:val="22"/>
+          <w:szCs w:val="22"/>
+        </w:rPr>
+        <w:t xml:space="preserve">R:</w:t>
+      </w:r>
+    </w:p>
+    <w:p>
+      <w:pPr>
         <w:pStyle w:val="Heading1"/>
         <w:spacing w:after="120" w:before="260"/>
       </w:pPr>
@@ -876,6 +971,36 @@
           <w:szCs w:val="22"/>
         </w:rPr>
         <w:t xml:space="preserve">Quais termos a empresa usa oficialmente para os seus serviços?</w:t>
+      </w:r>
+    </w:p>
+    <w:p>
+      <w:pPr>
+        <w:spacing w:after="140"/>
+        <w:jc w:val="both"/>
+      </w:pPr>
+      <w:r>
+        <w:rPr>
+          <w:rFonts w:ascii="Calibri" w:cs="Calibri" w:eastAsia="Calibri" w:hAnsi="Calibri"/>
+          <w:sz w:val="22"/>
+          <w:szCs w:val="22"/>
+        </w:rPr>
+        <w:t xml:space="preserve">R:</w:t>
+      </w:r>
+    </w:p>
+    <w:p>
+      <w:pPr>
+        <w:spacing w:after="140"/>
+        <w:jc w:val="both"/>
+      </w:pPr>
+      <w:r>
+        <w:rPr>
+          <w:rFonts w:ascii="Calibri" w:cs="Calibri" w:eastAsia="Calibri" w:hAnsi="Calibri"/>
+          <w:b/>
+          <w:bCs/>
+          <w:sz w:val="22"/>
+          <w:szCs w:val="22"/>
+        </w:rPr>
+        <w:t xml:space="preserve">Sua atividade é regulamentada por algum conselho profissional ou órgão (ex.: CRM, OAB, CREF, CRP, CRC)? Se sim, informe qual é e o número do registro.</w:t>
       </w:r>
     </w:p>
     <w:p>
@@ -1456,6 +1581,36 @@
     </w:p>
     <w:p>
       <w:pPr>
+        <w:spacing w:after="140"/>
+        <w:jc w:val="both"/>
+      </w:pPr>
+      <w:r>
+        <w:rPr>
+          <w:rFonts w:ascii="Calibri" w:cs="Calibri" w:eastAsia="Calibri" w:hAnsi="Calibri"/>
+          <w:b/>
+          <w:bCs/>
+          <w:sz w:val="22"/>
+          <w:szCs w:val="22"/>
+        </w:rPr>
+        <w:t xml:space="preserve">Podemos publicar imagens de pessoas (equipe, clientes)? Para cada pessoa que aparecer, você tem autorização para o uso da imagem?</w:t>
+      </w:r>
+    </w:p>
+    <w:p>
+      <w:pPr>
+        <w:spacing w:after="140"/>
+        <w:jc w:val="both"/>
+      </w:pPr>
+      <w:r>
+        <w:rPr>
+          <w:rFonts w:ascii="Calibri" w:cs="Calibri" w:eastAsia="Calibri" w:hAnsi="Calibri"/>
+          <w:sz w:val="22"/>
+          <w:szCs w:val="22"/>
+        </w:rPr>
+        <w:t xml:space="preserve">R:</w:t>
+      </w:r>
+    </w:p>
+    <w:p>
+      <w:pPr>
         <w:pStyle w:val="Heading1"/>
         <w:spacing w:after="120" w:before="260"/>
       </w:pPr>
@@ -1514,6 +1669,36 @@
           <w:szCs w:val="22"/>
         </w:rPr>
         <w:t xml:space="preserve">Ex.: chamar no WhatsApp, pedir orçamento, ligar, preencher formulário.</w:t>
+      </w:r>
+    </w:p>
+    <w:p>
+      <w:pPr>
+        <w:spacing w:after="140"/>
+        <w:jc w:val="both"/>
+      </w:pPr>
+      <w:r>
+        <w:rPr>
+          <w:rFonts w:ascii="Calibri" w:cs="Calibri" w:eastAsia="Calibri" w:hAnsi="Calibri"/>
+          <w:sz w:val="22"/>
+          <w:szCs w:val="22"/>
+        </w:rPr>
+        <w:t xml:space="preserve">R:</w:t>
+      </w:r>
+    </w:p>
+    <w:p>
+      <w:pPr>
+        <w:spacing w:after="140"/>
+        <w:jc w:val="both"/>
+      </w:pPr>
+      <w:r>
+        <w:rPr>
+          <w:rFonts w:ascii="Calibri" w:cs="Calibri" w:eastAsia="Calibri" w:hAnsi="Calibri"/>
+          <w:b/>
+          <w:bCs/>
+          <w:sz w:val="22"/>
+          <w:szCs w:val="22"/>
+        </w:rPr>
+        <w:t xml:space="preserve">Existe um prazo ideal para o site ficar no ar (por exemplo, uma data, evento ou campanha)?</w:t>
       </w:r>
     </w:p>
     <w:p>
@@ -1894,6 +2079,66 @@
     </w:p>
     <w:p>
       <w:pPr>
+        <w:spacing w:after="140"/>
+        <w:jc w:val="both"/>
+      </w:pPr>
+      <w:r>
+        <w:rPr>
+          <w:rFonts w:ascii="Calibri" w:cs="Calibri" w:eastAsia="Calibri" w:hAnsi="Calibri"/>
+          <w:b/>
+          <w:bCs/>
+          <w:sz w:val="22"/>
+          <w:szCs w:val="22"/>
+        </w:rPr>
+        <w:t xml:space="preserve">Você já tem domínio próprio (ex.: suaempresa.com.br)? Se não, qual nome gostaria de registrar? Lembrando: domínio e hospedagem são serviços de terceiros, contratados pelo próprio cliente.</w:t>
+      </w:r>
+    </w:p>
+    <w:p>
+      <w:pPr>
+        <w:spacing w:after="140"/>
+        <w:jc w:val="both"/>
+      </w:pPr>
+      <w:r>
+        <w:rPr>
+          <w:rFonts w:ascii="Calibri" w:cs="Calibri" w:eastAsia="Calibri" w:hAnsi="Calibri"/>
+          <w:sz w:val="22"/>
+          <w:szCs w:val="22"/>
+        </w:rPr>
+        <w:t xml:space="preserve">R:</w:t>
+      </w:r>
+    </w:p>
+    <w:p>
+      <w:pPr>
+        <w:spacing w:after="140"/>
+        <w:jc w:val="both"/>
+      </w:pPr>
+      <w:r>
+        <w:rPr>
+          <w:rFonts w:ascii="Calibri" w:cs="Calibri" w:eastAsia="Calibri" w:hAnsi="Calibri"/>
+          <w:b/>
+          <w:bCs/>
+          <w:sz w:val="22"/>
+          <w:szCs w:val="22"/>
+        </w:rPr>
+        <w:t xml:space="preserve">Para qual e-mail devem ser enviadas as mensagens recebidas pelo formulário do site?</w:t>
+      </w:r>
+    </w:p>
+    <w:p>
+      <w:pPr>
+        <w:spacing w:after="140"/>
+        <w:jc w:val="both"/>
+      </w:pPr>
+      <w:r>
+        <w:rPr>
+          <w:rFonts w:ascii="Calibri" w:cs="Calibri" w:eastAsia="Calibri" w:hAnsi="Calibri"/>
+          <w:sz w:val="22"/>
+          <w:szCs w:val="22"/>
+        </w:rPr>
+        <w:t xml:space="preserve">R:</w:t>
+      </w:r>
+    </w:p>
+    <w:p>
+      <w:pPr>
         <w:pStyle w:val="Heading1"/>
         <w:spacing w:after="120" w:before="260"/>
       </w:pPr>
@@ -1969,6 +2214,20 @@
     </w:p>
     <w:p>
       <w:pPr>
+        <w:spacing w:after="140"/>
+        <w:jc w:val="both"/>
+      </w:pPr>
+      <w:r>
+        <w:rPr>
+          <w:rFonts w:ascii="Calibri" w:cs="Calibri" w:eastAsia="Calibri" w:hAnsi="Calibri"/>
+          <w:sz w:val="22"/>
+          <w:szCs w:val="22"/>
+        </w:rPr>
+        <w:t xml:space="preserve">{#nicheSections}</w:t>
+      </w:r>
+    </w:p>
+    <w:p>
+      <w:pPr>
         <w:pStyle w:val="Heading1"/>
         <w:spacing w:after="120" w:before="260"/>
       </w:pPr>
@@ -1979,7 +2238,94 @@
           <w:sz w:val="26"/>
           <w:szCs w:val="26"/>
         </w:rPr>
-        <w:t xml:space="preserve">10. O que enviar junto com este briefing</w:t>
+        <w:t xml:space="preserve">{title}</w:t>
+      </w:r>
+    </w:p>
+    <w:p>
+      <w:pPr>
+        <w:spacing w:after="140"/>
+        <w:jc w:val="both"/>
+      </w:pPr>
+      <w:r>
+        <w:rPr>
+          <w:rFonts w:ascii="Calibri" w:cs="Calibri" w:eastAsia="Calibri" w:hAnsi="Calibri"/>
+          <w:sz w:val="22"/>
+          <w:szCs w:val="22"/>
+        </w:rPr>
+        <w:t xml:space="preserve">{#questions}</w:t>
+      </w:r>
+    </w:p>
+    <w:p>
+      <w:pPr>
+        <w:spacing w:after="140"/>
+        <w:jc w:val="both"/>
+      </w:pPr>
+      <w:r>
+        <w:rPr>
+          <w:rFonts w:ascii="Calibri" w:cs="Calibri" w:eastAsia="Calibri" w:hAnsi="Calibri"/>
+          <w:b/>
+          <w:bCs/>
+          <w:sz w:val="22"/>
+          <w:szCs w:val="22"/>
+        </w:rPr>
+        <w:t xml:space="preserve">{text}</w:t>
+      </w:r>
+    </w:p>
+    <w:p>
+      <w:pPr>
+        <w:spacing w:after="140"/>
+        <w:jc w:val="both"/>
+      </w:pPr>
+      <w:r>
+        <w:rPr>
+          <w:rFonts w:ascii="Calibri" w:cs="Calibri" w:eastAsia="Calibri" w:hAnsi="Calibri"/>
+          <w:sz w:val="22"/>
+          <w:szCs w:val="22"/>
+        </w:rPr>
+        <w:t xml:space="preserve">R:</w:t>
+      </w:r>
+    </w:p>
+    <w:p>
+      <w:pPr>
+        <w:spacing w:after="140"/>
+        <w:jc w:val="both"/>
+      </w:pPr>
+      <w:r>
+        <w:rPr>
+          <w:rFonts w:ascii="Calibri" w:cs="Calibri" w:eastAsia="Calibri" w:hAnsi="Calibri"/>
+          <w:sz w:val="22"/>
+          <w:szCs w:val="22"/>
+        </w:rPr>
+        <w:t xml:space="preserve">{/questions}</w:t>
+      </w:r>
+    </w:p>
+    <w:p>
+      <w:pPr>
+        <w:spacing w:after="140"/>
+        <w:jc w:val="both"/>
+      </w:pPr>
+      <w:r>
+        <w:rPr>
+          <w:rFonts w:ascii="Calibri" w:cs="Calibri" w:eastAsia="Calibri" w:hAnsi="Calibri"/>
+          <w:sz w:val="22"/>
+          <w:szCs w:val="22"/>
+        </w:rPr>
+        <w:t xml:space="preserve">{/nicheSections}</w:t>
+      </w:r>
+    </w:p>
+    <w:p>
+      <w:pPr>
+        <w:pStyle w:val="Heading1"/>
+        <w:spacing w:after="120" w:before="260"/>
+      </w:pPr>
+      <w:r>
+        <w:rPr>
+          <w:rFonts w:ascii="Calibri" w:cs="Calibri" w:eastAsia="Calibri" w:hAnsi="Calibri"/>
+          <w:color w:val="2E74B5"/>
+          <w:sz w:val="26"/>
+          <w:szCs w:val="26"/>
+        </w:rPr>
+        <w:t xml:space="preserve">{sendSectionNumber}. O que enviar junto com este briefing</w:t>
       </w:r>
     </w:p>
     <w:tbl>
@@ -2117,7 +2463,7 @@
                 <w:sz w:val="22"/>
                 <w:szCs w:val="22"/>
               </w:rPr>
-              <w:t xml:space="preserve">☐ Fotos de estrutura/veículos</w:t>
+              <w:t xml:space="preserve">☐ Fotos de estrutura/local/equipamentos</w:t>
             </w:r>
           </w:p>
         </w:tc>
@@ -2326,7 +2672,7 @@
           <w:sz w:val="26"/>
           <w:szCs w:val="26"/>
         </w:rPr>
-        <w:t xml:space="preserve">11. Observações finais</w:t>
+        <w:t xml:space="preserve">{finalSectionNumber}. Observações finais</w:t>
       </w:r>
     </w:p>
     <w:p>
@@ -2357,6 +2703,23 @@
           <w:szCs w:val="22"/>
         </w:rPr>
         <w:t xml:space="preserve">R:</w:t>
+      </w:r>
+    </w:p>
+    <w:p>
+      <w:pPr>
+        <w:spacing w:after="140"/>
+        <w:jc w:val="both"/>
+      </w:pPr>
+      <w:r>
+        <w:rPr>
+          <w:rFonts w:ascii="Calibri" w:cs="Calibri" w:eastAsia="Calibri" w:hAnsi="Calibri"/>
+          <w:i/>
+          <w:iCs/>
+          <w:color w:val="555555"/>
+          <w:sz w:val="22"/>
+          <w:szCs w:val="22"/>
+        </w:rPr>
+        <w:t xml:space="preserve">Os dados informados neste briefing serão usados somente para a elaboração do seu projeto.</w:t>
       </w:r>
     </w:p>
     <w:p>

</xml_diff>